<commit_message>
docs: finalize project report cover page
</commit_message>
<xml_diff>
--- a/report/final/enhanced_sw_project_report.docx
+++ b/report/final/enhanced_sw_project_report.docx
@@ -32,158 +32,33 @@
       <w:pPr>
         <w:spacing w:before="0" w:after="80" w:line="276" w:lineRule="auto"/>
       </w:pPr>
-      <w:r/>
-      <w:r>
-        <w:rPr>
-          <w:b/>
-        </w:rPr>
-        <w:t>Academic Project Report</w:t>
-      </w:r>
-      <w:r/>
+      <w:r>
+        <w:t>Chirag Bhalotia — 1032232301</w:t>
+      </w:r>
     </w:p>
     <w:p>
       <w:pPr>
         <w:spacing w:before="0" w:after="80" w:line="276" w:lineRule="auto"/>
       </w:pPr>
       <w:r>
-        <w:t>Submitted in partial fulfillment of the requirements for the degree of</w:t>
+        <w:t>Harsh Malu — 1032232445</w:t>
       </w:r>
     </w:p>
     <w:p>
       <w:pPr>
         <w:spacing w:before="0" w:after="80" w:line="276" w:lineRule="auto"/>
       </w:pPr>
-      <w:r/>
-      <w:r>
-        <w:rPr>
-          <w:b/>
-        </w:rPr>
-        <w:t>Bachelor of Technology in Computer Science and Engineering / Artificial Intelligence and Machine Learning</w:t>
-      </w:r>
-      <w:r/>
+      <w:r>
+        <w:t>Aditya Raj — 1032232452</w:t>
+      </w:r>
     </w:p>
     <w:p>
       <w:pPr>
         <w:spacing w:before="0" w:after="80" w:line="276" w:lineRule="auto"/>
       </w:pPr>
-      <w:r/>
-      <w:r>
-        <w:rPr>
-          <w:b/>
-        </w:rPr>
-        <w:t>Submitted by:</w:t>
-      </w:r>
-      <w:r/>
-    </w:p>
-    <w:p>
-      <w:pPr>
-        <w:spacing w:before="0" w:after="80" w:line="276" w:lineRule="auto"/>
-      </w:pPr>
-      <w:r>
-        <w:t xml:space="preserve">- </w:t>
-      </w:r>
-      <w:r>
-        <w:rPr>
-          <w:b/>
-        </w:rPr>
-        <w:t>[STUDENT NAME]</w:t>
-      </w:r>
-      <w:r>
-        <w:t xml:space="preserve"> ([ROLL NUMBER])</w:t>
-      </w:r>
-    </w:p>
-    <w:p>
-      <w:pPr>
-        <w:spacing w:before="0" w:after="80" w:line="276" w:lineRule="auto"/>
-      </w:pPr>
-      <w:r>
-        <w:t xml:space="preserve">- </w:t>
-      </w:r>
-      <w:r>
-        <w:rPr>
-          <w:b/>
-        </w:rPr>
-        <w:t>[STUDENT NAME 2]</w:t>
-      </w:r>
-      <w:r>
-        <w:t xml:space="preserve"> ([ROLL NUMBER 2])</w:t>
-      </w:r>
-    </w:p>
-    <w:p>
-      <w:pPr>
-        <w:spacing w:before="0" w:after="80" w:line="276" w:lineRule="auto"/>
-      </w:pPr>
-      <w:r/>
-      <w:r>
-        <w:rPr>
-          <w:b/>
-        </w:rPr>
-        <w:t>Under the Guidance of:</w:t>
-      </w:r>
-      <w:r/>
-    </w:p>
-    <w:p>
-      <w:pPr>
-        <w:spacing w:before="0" w:after="80" w:line="276" w:lineRule="auto"/>
-      </w:pPr>
-      <w:r>
-        <w:t xml:space="preserve">- </w:t>
-      </w:r>
-      <w:r>
-        <w:rPr>
-          <w:b/>
-        </w:rPr>
-        <w:t>[PROJECT GUIDE / SUPERVISOR NAME]</w:t>
-      </w:r>
-      <w:r>
-        <w:t xml:space="preserve">, </w:t>
-      </w:r>
-      <w:r>
-        <w:rPr>
-          <w:i/>
-        </w:rPr>
-        <w:t>[Designation, Department]</w:t>
-      </w:r>
-      <w:r/>
-    </w:p>
-    <w:p>
-      <w:pPr>
-        <w:spacing w:before="0" w:after="80" w:line="276" w:lineRule="auto"/>
-      </w:pPr>
-      <w:r/>
-      <w:r>
-        <w:rPr>
-          <w:b/>
-        </w:rPr>
-        <w:t>Department of Computer Science and Engineering</w:t>
-      </w:r>
-      <w:r/>
-    </w:p>
-    <w:p>
-      <w:pPr>
-        <w:spacing w:before="0" w:after="80" w:line="276" w:lineRule="auto"/>
-      </w:pPr>
-      <w:r/>
-      <w:r>
-        <w:rPr>
-          <w:b/>
-        </w:rPr>
-        <w:t>[INSTITUTION / UNIVERSITY NAME]</w:t>
-      </w:r>
-      <w:r/>
-    </w:p>
-    <w:p>
-      <w:pPr>
-        <w:spacing w:before="0" w:after="80" w:line="276" w:lineRule="auto"/>
-      </w:pPr>
-      <w:r/>
-      <w:r>
-        <w:rPr>
-          <w:b/>
-        </w:rPr>
-        <w:t>[ACADEMIC YEAR]</w:t>
-      </w:r>
-      <w:r/>
+      <w:r>
+        <w:t>Archit Kankaria — 1032231900</w:t>
+      </w:r>
     </w:p>
     <w:p>
       <w:pPr>

</xml_diff>